<commit_message>
Update Transformer VAE model and add ddos hybrid detector
</commit_message>
<xml_diff>
--- a/Report.docx
+++ b/Report.docx
@@ -7357,6 +7357,11 @@
       </w:r>
     </w:p>
     <w:p>
+      <w:pPr>
+        <w:rPr>
+          <w:lang w:val="vi-VN"/>
+        </w:rPr>
+      </w:pPr>
       <w:r>
         <w:rPr>
           <w:b/>
@@ -7370,148 +7375,256 @@
     </w:p>
     <w:p>
       <w:r>
-        <mc:AlternateContent>
-          <mc:Choice Requires="wps">
-            <w:drawing>
-              <wp:inline distT="0" distB="0" distL="0" distR="0" wp14:anchorId="73EDA696" wp14:editId="7A032C8A">
-                <wp:extent cx="228600" cy="228600"/>
-                <wp:effectExtent l="0" t="0" r="0" b="0"/>
-                <wp:docPr id="298545029" name="Rectangle 6"/>
-                <wp:cNvGraphicFramePr>
-                  <a:graphicFrameLocks xmlns:a="http://schemas.openxmlformats.org/drawingml/2006/main" noChangeAspect="1"/>
-                </wp:cNvGraphicFramePr>
-                <a:graphic xmlns:a="http://schemas.openxmlformats.org/drawingml/2006/main">
-                  <a:graphicData uri="http://schemas.microsoft.com/office/word/2010/wordprocessingShape">
-                    <wps:wsp>
-                      <wps:cNvSpPr>
-                        <a:spLocks noChangeAspect="1" noChangeArrowheads="1"/>
-                      </wps:cNvSpPr>
-                      <wps:spPr bwMode="auto">
-                        <a:xfrm>
-                          <a:off x="0" y="0"/>
-                          <a:ext cx="228600" cy="228600"/>
-                        </a:xfrm>
-                        <a:prstGeom prst="rect">
-                          <a:avLst/>
-                        </a:prstGeom>
-                        <a:noFill/>
-                        <a:ln>
-                          <a:noFill/>
-                        </a:ln>
-                        <a:extLst>
-                          <a:ext uri="{909E8E84-426E-40DD-AFC4-6F175D3DCCD1}">
-                            <a14:hiddenFill xmlns:a14="http://schemas.microsoft.com/office/drawing/2010/main">
-                              <a:solidFill>
-                                <a:srgbClr val="FFFFFF"/>
-                              </a:solidFill>
-                            </a14:hiddenFill>
-                          </a:ext>
-                          <a:ext uri="{91240B29-F687-4F45-9708-019B960494DF}">
-                            <a14:hiddenLine xmlns:a14="http://schemas.microsoft.com/office/drawing/2010/main" w="9525">
-                              <a:solidFill>
-                                <a:srgbClr val="000000"/>
-                              </a:solidFill>
-                              <a:miter lim="800000"/>
-                              <a:headEnd/>
-                              <a:tailEnd/>
-                            </a14:hiddenLine>
-                          </a:ext>
-                        </a:extLst>
-                      </wps:spPr>
-                      <wps:bodyPr rot="0" vert="horz" wrap="square" lIns="91440" tIns="45720" rIns="91440" bIns="45720" anchor="t" anchorCtr="0" upright="1">
-                        <a:noAutofit/>
-                      </wps:bodyPr>
-                    </wps:wsp>
-                  </a:graphicData>
-                </a:graphic>
-              </wp:inline>
-            </w:drawing>
-          </mc:Choice>
-          <mc:Fallback>
-            <w:pict>
-              <v:rect w14:anchorId="0D88C81A" id="Rectangle 6" o:spid="_x0000_s1026" style="width:18pt;height:18pt;visibility:visible;mso-wrap-style:square;mso-left-percent:-10001;mso-top-percent:-10001;mso-position-horizontal:absolute;mso-position-horizontal-relative:char;mso-position-vertical:absolute;mso-position-vertical-relative:line;mso-left-percent:-10001;mso-top-percent:-10001;v-text-anchor:top" o:gfxdata="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" filled="f" stroked="f">
-                <o:lock v:ext="edit" aspectratio="t"/>
-                <w10:anchorlock/>
-              </v:rect>
-            </w:pict>
-          </mc:Fallback>
-        </mc:AlternateContent>
-      </w:r>
-    </w:p>
-    <w:p>
-      <w:r>
-        <mc:AlternateContent>
-          <mc:Choice Requires="wps">
-            <w:drawing>
-              <wp:inline distT="0" distB="0" distL="0" distR="0" wp14:anchorId="7F1CAC71" wp14:editId="6A588667">
-                <wp:extent cx="304800" cy="304800"/>
-                <wp:effectExtent l="0" t="0" r="0" b="0"/>
-                <wp:docPr id="1544968239" name="Rectangle 5"/>
-                <wp:cNvGraphicFramePr>
-                  <a:graphicFrameLocks xmlns:a="http://schemas.openxmlformats.org/drawingml/2006/main" noChangeAspect="1"/>
-                </wp:cNvGraphicFramePr>
-                <a:graphic xmlns:a="http://schemas.openxmlformats.org/drawingml/2006/main">
-                  <a:graphicData uri="http://schemas.microsoft.com/office/word/2010/wordprocessingShape">
-                    <wps:wsp>
-                      <wps:cNvSpPr>
-                        <a:spLocks noChangeAspect="1" noChangeArrowheads="1"/>
-                      </wps:cNvSpPr>
-                      <wps:spPr bwMode="auto">
-                        <a:xfrm>
-                          <a:off x="0" y="0"/>
-                          <a:ext cx="304800" cy="304800"/>
-                        </a:xfrm>
-                        <a:prstGeom prst="rect">
-                          <a:avLst/>
-                        </a:prstGeom>
-                        <a:noFill/>
-                        <a:ln>
-                          <a:noFill/>
-                        </a:ln>
-                        <a:extLst>
-                          <a:ext uri="{909E8E84-426E-40DD-AFC4-6F175D3DCCD1}">
-                            <a14:hiddenFill xmlns:a14="http://schemas.microsoft.com/office/drawing/2010/main">
-                              <a:solidFill>
-                                <a:srgbClr val="FFFFFF"/>
-                              </a:solidFill>
-                            </a14:hiddenFill>
-                          </a:ext>
-                          <a:ext uri="{91240B29-F687-4F45-9708-019B960494DF}">
-                            <a14:hiddenLine xmlns:a14="http://schemas.microsoft.com/office/drawing/2010/main" w="9525">
-                              <a:solidFill>
-                                <a:srgbClr val="000000"/>
-                              </a:solidFill>
-                              <a:miter lim="800000"/>
-                              <a:headEnd/>
-                              <a:tailEnd/>
-                            </a14:hiddenLine>
-                          </a:ext>
-                        </a:extLst>
-                      </wps:spPr>
-                      <wps:bodyPr rot="0" vert="horz" wrap="square" lIns="91440" tIns="45720" rIns="91440" bIns="45720" anchor="t" anchorCtr="0" upright="1">
-                        <a:noAutofit/>
-                      </wps:bodyPr>
-                    </wps:wsp>
-                  </a:graphicData>
-                </a:graphic>
-              </wp:inline>
-            </w:drawing>
-          </mc:Choice>
-          <mc:Fallback>
-            <w:pict>
-              <v:rect w14:anchorId="32D4A10E" id="Rectangle 5" o:spid="_x0000_s1026" style="width:24pt;height:24pt;visibility:visible;mso-wrap-style:square;mso-left-percent:-10001;mso-top-percent:-10001;mso-position-horizontal:absolute;mso-position-horizontal-relative:char;mso-position-vertical:absolute;mso-position-vertical-relative:line;mso-left-percent:-10001;mso-top-percent:-10001;v-text-anchor:top" o:gfxdata="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" filled="f" stroked="f">
-                <o:lock v:ext="edit" aspectratio="t"/>
-                <w10:anchorlock/>
-              </v:rect>
-            </w:pict>
-          </mc:Fallback>
-        </mc:AlternateContent>
-      </w:r>
-    </w:p>
-    <w:p>
-      <w:r>
-        <w:t>1</w:t>
-      </w:r>
+        <w:rPr>
+          <w:b/>
+          <w:bCs/>
+        </w:rPr>
+        <w:t>1. Nhóm Bắt Cực Tốt (Tỉ lệ đạt từ 84% đến 100%):</w:t>
+      </w:r>
+      <w:r>
+        <w:t> Mô hình hoạt động vô cùng hiệu quả để chặn đứng các cuộc tấn công đánh sập băng thông hoặc quét lỗ hổng theo dạng luồng dồn dập (Nhờ sức mạnh của lõi Conv1D):</w:t>
+      </w:r>
+    </w:p>
+    <w:p>
+      <w:pPr>
+        <w:numPr>
+          <w:ilvl w:val="0"/>
+          <w:numId w:val="7"/>
+        </w:numPr>
+      </w:pPr>
+      <w:r>
+        <w:rPr>
+          <w:b/>
+          <w:bCs/>
+        </w:rPr>
+        <w:t>Infiltration (Thâm nhập nội bộ):</w:t>
+      </w:r>
+      <w:r>
+        <w:t> 100.0%</w:t>
+      </w:r>
+    </w:p>
+    <w:p>
+      <w:pPr>
+        <w:numPr>
+          <w:ilvl w:val="0"/>
+          <w:numId w:val="7"/>
+        </w:numPr>
+      </w:pPr>
+      <w:r>
+        <w:rPr>
+          <w:b/>
+          <w:bCs/>
+        </w:rPr>
+        <w:t>Web Attack - XSS:</w:t>
+      </w:r>
+      <w:r>
+        <w:t> 100.0%</w:t>
+      </w:r>
+    </w:p>
+    <w:p>
+      <w:pPr>
+        <w:numPr>
+          <w:ilvl w:val="0"/>
+          <w:numId w:val="7"/>
+        </w:numPr>
+      </w:pPr>
+      <w:r>
+        <w:rPr>
+          <w:b/>
+          <w:bCs/>
+        </w:rPr>
+        <w:t>Web Attack - Brute Force:</w:t>
+      </w:r>
+      <w:r>
+        <w:t> 99.7%</w:t>
+      </w:r>
+    </w:p>
+    <w:p>
+      <w:pPr>
+        <w:numPr>
+          <w:ilvl w:val="0"/>
+          <w:numId w:val="7"/>
+        </w:numPr>
+      </w:pPr>
+      <w:r>
+        <w:rPr>
+          <w:b/>
+          <w:bCs/>
+        </w:rPr>
+        <w:t>FTP-Patator (Dò mật khẩu FTP):</w:t>
+      </w:r>
+      <w:r>
+        <w:t> 99.5%</w:t>
+      </w:r>
+    </w:p>
+    <w:p>
+      <w:pPr>
+        <w:numPr>
+          <w:ilvl w:val="0"/>
+          <w:numId w:val="7"/>
+        </w:numPr>
+      </w:pPr>
+      <w:r>
+        <w:rPr>
+          <w:b/>
+          <w:bCs/>
+        </w:rPr>
+        <w:t>DoS slowloris &amp; Slowhttptest:</w:t>
+      </w:r>
+      <w:r>
+        <w:t> 95.0% - 95.9%</w:t>
+      </w:r>
+    </w:p>
+    <w:p>
+      <w:pPr>
+        <w:numPr>
+          <w:ilvl w:val="0"/>
+          <w:numId w:val="7"/>
+        </w:numPr>
+      </w:pPr>
+      <w:r>
+        <w:rPr>
+          <w:b/>
+          <w:bCs/>
+        </w:rPr>
+        <w:t>SSH-Patator (Dò mật khẩu SSH):</w:t>
+      </w:r>
+      <w:r>
+        <w:t> 86.4%</w:t>
+      </w:r>
+    </w:p>
+    <w:p>
+      <w:pPr>
+        <w:numPr>
+          <w:ilvl w:val="0"/>
+          <w:numId w:val="7"/>
+        </w:numPr>
+      </w:pPr>
+      <w:r>
+        <w:rPr>
+          <w:b/>
+          <w:bCs/>
+        </w:rPr>
+        <w:t>DoS GoldenEye &amp; DoS Hulk:</w:t>
+      </w:r>
+      <w:r>
+        <w:t> 84.6% - 85.0%</w:t>
+      </w:r>
+    </w:p>
+    <w:p>
+      <w:r>
+        <w:rPr>
+          <w:b/>
+          <w:bCs/>
+        </w:rPr>
+        <w:t>2. Nhóm Bắt Trung Bình (Tỉ lệ đạt 43.8%):</w:t>
+      </w:r>
+    </w:p>
+    <w:p>
+      <w:pPr>
+        <w:numPr>
+          <w:ilvl w:val="0"/>
+          <w:numId w:val="8"/>
+        </w:numPr>
+      </w:pPr>
+      <w:r>
+        <w:rPr>
+          <w:b/>
+          <w:bCs/>
+        </w:rPr>
+        <w:t>DDoS:</w:t>
+      </w:r>
+      <w:r>
+        <w:t> 43.8%. Kẻ tấn công huy động hàng triệu máy tính rác (zombie/botnet) đập vào. Một nửa các cuộc ráo riết bị bắt, nhưng một nửa lại hoà tan vào dữ liệu bình thường (Vì chúng cố bắt chước lưu lượng của người dùng internet đang F5 tải lại trang).</w:t>
+      </w:r>
+    </w:p>
+    <w:p>
+      <w:r>
+        <w:rPr>
+          <w:b/>
+          <w:bCs/>
+        </w:rPr>
+        <w:lastRenderedPageBreak/>
+        <w:t>3. Nhóm Bắt Kém &amp; Bị Bỏ Lọt Hoàn Toàn (Tỉ lệ đạt 0.0%):</w:t>
+      </w:r>
+      <w:r>
+        <w:t> Chính 2 loại tấn công này mang số lượng siêu lớn nhưng mô hình lại bỏ lọt 100% nên đã "kéo tụt" dã man tỉ lệ tổng từ 95% xuống còn 51.28%:</w:t>
+      </w:r>
+    </w:p>
+    <w:p>
+      <w:pPr>
+        <w:numPr>
+          <w:ilvl w:val="0"/>
+          <w:numId w:val="9"/>
+        </w:numPr>
+      </w:pPr>
+      <w:r>
+        <w:rPr>
+          <w:b/>
+          <w:bCs/>
+        </w:rPr>
+        <w:t>PortScan:</w:t>
+      </w:r>
+      <w:r>
+        <w:t> (Hơn 158 nghìn mẫu lọt). Kẻ tấn công dò la cổng dịch vụ bằng cách rà từng ping nhẹ nhàng. Gói tin nhỏ nhẹ không mang tính sát thương nên quá trình tạo mã mô hình (VAE) tái tạo lại rất mượt mà.</w:t>
+      </w:r>
+    </w:p>
+    <w:p>
+      <w:pPr>
+        <w:numPr>
+          <w:ilvl w:val="0"/>
+          <w:numId w:val="9"/>
+        </w:numPr>
+      </w:pPr>
+      <w:r>
+        <w:rPr>
+          <w:b/>
+          <w:bCs/>
+        </w:rPr>
+        <w:t>Bot:</w:t>
+      </w:r>
+      <w:r>
+        <w:t> Tương tự PortScan.</w:t>
+      </w:r>
+    </w:p>
+    <w:p>
+      <w:r>
+        <w:rPr>
+          <w:b/>
+          <w:bCs/>
+        </w:rPr>
+        <w:t>Tóm lại:</w:t>
+      </w:r>
+      <w:r>
+        <w:t> Nếu bạn đối mặt trực diện với các cuộc tấn công phá hoại web, bòn rút máy chủ tàn khốc, tỷ lệ ngăn chặn của hệ thống hiện tại đang xấp xỉ </w:t>
+      </w:r>
+      <w:r>
+        <w:rPr>
+          <w:b/>
+          <w:bCs/>
+        </w:rPr>
+        <w:t>90% - 99%</w:t>
+      </w:r>
+      <w:r>
+        <w:t>. Con số trung bình </w:t>
+      </w:r>
+      <w:r>
+        <w:rPr>
+          <w:b/>
+          <w:bCs/>
+        </w:rPr>
+        <w:t>51.28%</w:t>
+      </w:r>
+      <w:r>
+        <w:t> mang tính đánh lừa vì nó chứa 158,000 cái Ping dò cổng mạng của PortScan (thứ hiện tại 10 features của mình chưa đủ sức bắt).</w:t>
+      </w:r>
+    </w:p>
+    <w:p>
+      <w:pPr>
+        <w:rPr>
+          <w:lang w:val="vi-VN"/>
+        </w:rPr>
+      </w:pPr>
     </w:p>
     <w:p>
       <w:pPr>
@@ -7540,6 +7653,155 @@
 <file path=word/numbering.xml><?xml version="1.0" encoding="utf-8"?>
 <w:numbering xmlns:wpc="http://schemas.microsoft.com/office/word/2010/wordprocessingCanvas" xmlns:cx="http://schemas.microsoft.com/office/drawing/2014/chartex" xmlns:cx1="http://schemas.microsoft.com/office/drawing/2015/9/8/chartex" xmlns:cx2="http://schemas.microsoft.com/office/drawing/2015/10/21/chartex" xmlns:cx3="http://schemas.microsoft.com/office/drawing/2016/5/9/chartex" xmlns:cx4="http://schemas.microsoft.com/office/drawing/2016/5/10/chartex" xmlns:cx5="http://schemas.microsoft.com/office/drawing/2016/5/11/chartex" xmlns:cx6="http://schemas.microsoft.com/office/drawing/2016/5/12/chartex" xmlns:cx7="http://schemas.microsoft.com/office/drawing/2016/5/13/chartex" xmlns:cx8="http://schemas.microsoft.com/office/drawing/2016/5/14/chartex" xmlns:mc="http://schemas.openxmlformats.org/markup-compatibility/2006" xmlns:aink="http://schemas.microsoft.com/office/drawing/2016/ink" xmlns:am3d="http://schemas.microsoft.com/office/drawing/2017/model3d" xmlns:o="urn:schemas-microsoft-com:office:office" xmlns:oel="http://schemas.microsoft.com/office/2019/extlst" xmlns:r="http://schemas.openxmlformats.org/officeDocument/2006/relationships" xmlns:m="http://schemas.openxmlformats.org/officeDocument/2006/math" xmlns:v="urn:schemas-microsoft-com:vml" xmlns:wp14="http://schemas.microsoft.com/office/word/2010/wordprocessingDrawing" xmlns:wp="http://schemas.openxmlformats.org/drawingml/2006/wordprocessingDrawing" xmlns:w10="urn:schemas-microsoft-com:office:word" xmlns:w="http://schemas.openxmlformats.org/wordprocessingml/2006/main" xmlns:w14="http://schemas.microsoft.com/office/word/2010/wordml" xmlns:w15="http://schemas.microsoft.com/office/word/2012/wordml" xmlns:w16cex="http://schemas.microsoft.com/office/word/2018/wordml/cex" xmlns:w16cid="http://schemas.microsoft.com/office/word/2016/wordml/cid" xmlns:w16="http://schemas.microsoft.com/office/word/2018/wordml" xmlns:w16du="http://schemas.microsoft.com/office/word/2023/wordml/word16du" xmlns:w16sdtdh="http://schemas.microsoft.com/office/word/2020/wordml/sdtdatahash" xmlns:w16sdtfl="http://schemas.microsoft.com/office/word/2024/wordml/sdtformatlock" xmlns:w16se="http://schemas.microsoft.com/office/word/2015/wordml/symex" xmlns:wpg="http://schemas.microsoft.com/office/word/2010/wordprocessingGroup" xmlns:wpi="http://schemas.microsoft.com/office/word/2010/wordprocessingInk" xmlns:wne="http://schemas.microsoft.com/office/word/2006/wordml" xmlns:wps="http://schemas.microsoft.com/office/word/2010/wordprocessingShape" mc:Ignorable="w14 w15 w16se w16cid w16 w16cex w16sdtdh w16sdtfl w16du wp14">
   <w:abstractNum w:abstractNumId="0" w15:restartNumberingAfterBreak="0">
+    <w:nsid w:val="023A29D6"/>
+    <w:multiLevelType w:val="multilevel"/>
+    <w:tmpl w:val="4ED849A8"/>
+    <w:lvl w:ilvl="0">
+      <w:start w:val="1"/>
+      <w:numFmt w:val="bullet"/>
+      <w:lvlText w:val=""/>
+      <w:lvlJc w:val="left"/>
+      <w:pPr>
+        <w:tabs>
+          <w:tab w:val="num" w:pos="720"/>
+        </w:tabs>
+        <w:ind w:left="720" w:hanging="360"/>
+      </w:pPr>
+      <w:rPr>
+        <w:rFonts w:ascii="Symbol" w:hAnsi="Symbol" w:hint="default"/>
+        <w:sz w:val="20"/>
+      </w:rPr>
+    </w:lvl>
+    <w:lvl w:ilvl="1" w:tentative="1">
+      <w:start w:val="1"/>
+      <w:numFmt w:val="bullet"/>
+      <w:lvlText w:val=""/>
+      <w:lvlJc w:val="left"/>
+      <w:pPr>
+        <w:tabs>
+          <w:tab w:val="num" w:pos="1440"/>
+        </w:tabs>
+        <w:ind w:left="1440" w:hanging="360"/>
+      </w:pPr>
+      <w:rPr>
+        <w:rFonts w:ascii="Symbol" w:hAnsi="Symbol" w:hint="default"/>
+        <w:sz w:val="20"/>
+      </w:rPr>
+    </w:lvl>
+    <w:lvl w:ilvl="2" w:tentative="1">
+      <w:start w:val="1"/>
+      <w:numFmt w:val="bullet"/>
+      <w:lvlText w:val=""/>
+      <w:lvlJc w:val="left"/>
+      <w:pPr>
+        <w:tabs>
+          <w:tab w:val="num" w:pos="2160"/>
+        </w:tabs>
+        <w:ind w:left="2160" w:hanging="360"/>
+      </w:pPr>
+      <w:rPr>
+        <w:rFonts w:ascii="Symbol" w:hAnsi="Symbol" w:hint="default"/>
+        <w:sz w:val="20"/>
+      </w:rPr>
+    </w:lvl>
+    <w:lvl w:ilvl="3" w:tentative="1">
+      <w:start w:val="1"/>
+      <w:numFmt w:val="bullet"/>
+      <w:lvlText w:val=""/>
+      <w:lvlJc w:val="left"/>
+      <w:pPr>
+        <w:tabs>
+          <w:tab w:val="num" w:pos="2880"/>
+        </w:tabs>
+        <w:ind w:left="2880" w:hanging="360"/>
+      </w:pPr>
+      <w:rPr>
+        <w:rFonts w:ascii="Symbol" w:hAnsi="Symbol" w:hint="default"/>
+        <w:sz w:val="20"/>
+      </w:rPr>
+    </w:lvl>
+    <w:lvl w:ilvl="4" w:tentative="1">
+      <w:start w:val="1"/>
+      <w:numFmt w:val="bullet"/>
+      <w:lvlText w:val=""/>
+      <w:lvlJc w:val="left"/>
+      <w:pPr>
+        <w:tabs>
+          <w:tab w:val="num" w:pos="3600"/>
+        </w:tabs>
+        <w:ind w:left="3600" w:hanging="360"/>
+      </w:pPr>
+      <w:rPr>
+        <w:rFonts w:ascii="Symbol" w:hAnsi="Symbol" w:hint="default"/>
+        <w:sz w:val="20"/>
+      </w:rPr>
+    </w:lvl>
+    <w:lvl w:ilvl="5" w:tentative="1">
+      <w:start w:val="1"/>
+      <w:numFmt w:val="bullet"/>
+      <w:lvlText w:val=""/>
+      <w:lvlJc w:val="left"/>
+      <w:pPr>
+        <w:tabs>
+          <w:tab w:val="num" w:pos="4320"/>
+        </w:tabs>
+        <w:ind w:left="4320" w:hanging="360"/>
+      </w:pPr>
+      <w:rPr>
+        <w:rFonts w:ascii="Symbol" w:hAnsi="Symbol" w:hint="default"/>
+        <w:sz w:val="20"/>
+      </w:rPr>
+    </w:lvl>
+    <w:lvl w:ilvl="6" w:tentative="1">
+      <w:start w:val="1"/>
+      <w:numFmt w:val="bullet"/>
+      <w:lvlText w:val=""/>
+      <w:lvlJc w:val="left"/>
+      <w:pPr>
+        <w:tabs>
+          <w:tab w:val="num" w:pos="5040"/>
+        </w:tabs>
+        <w:ind w:left="5040" w:hanging="360"/>
+      </w:pPr>
+      <w:rPr>
+        <w:rFonts w:ascii="Symbol" w:hAnsi="Symbol" w:hint="default"/>
+        <w:sz w:val="20"/>
+      </w:rPr>
+    </w:lvl>
+    <w:lvl w:ilvl="7" w:tentative="1">
+      <w:start w:val="1"/>
+      <w:numFmt w:val="bullet"/>
+      <w:lvlText w:val=""/>
+      <w:lvlJc w:val="left"/>
+      <w:pPr>
+        <w:tabs>
+          <w:tab w:val="num" w:pos="5760"/>
+        </w:tabs>
+        <w:ind w:left="5760" w:hanging="360"/>
+      </w:pPr>
+      <w:rPr>
+        <w:rFonts w:ascii="Symbol" w:hAnsi="Symbol" w:hint="default"/>
+        <w:sz w:val="20"/>
+      </w:rPr>
+    </w:lvl>
+    <w:lvl w:ilvl="8" w:tentative="1">
+      <w:start w:val="1"/>
+      <w:numFmt w:val="bullet"/>
+      <w:lvlText w:val=""/>
+      <w:lvlJc w:val="left"/>
+      <w:pPr>
+        <w:tabs>
+          <w:tab w:val="num" w:pos="6480"/>
+        </w:tabs>
+        <w:ind w:left="6480" w:hanging="360"/>
+      </w:pPr>
+      <w:rPr>
+        <w:rFonts w:ascii="Symbol" w:hAnsi="Symbol" w:hint="default"/>
+        <w:sz w:val="20"/>
+      </w:rPr>
+    </w:lvl>
+  </w:abstractNum>
+  <w:abstractNum w:abstractNumId="1" w15:restartNumberingAfterBreak="0">
     <w:nsid w:val="0AA33616"/>
     <w:multiLevelType w:val="multilevel"/>
     <w:tmpl w:val="55E0C8C6"/>
@@ -7688,7 +7950,7 @@
       </w:rPr>
     </w:lvl>
   </w:abstractNum>
-  <w:abstractNum w:abstractNumId="1" w15:restartNumberingAfterBreak="0">
+  <w:abstractNum w:abstractNumId="2" w15:restartNumberingAfterBreak="0">
     <w:nsid w:val="2EB06300"/>
     <w:multiLevelType w:val="multilevel"/>
     <w:tmpl w:val="67A22560"/>
@@ -7837,7 +8099,156 @@
       </w:rPr>
     </w:lvl>
   </w:abstractNum>
-  <w:abstractNum w:abstractNumId="2" w15:restartNumberingAfterBreak="0">
+  <w:abstractNum w:abstractNumId="3" w15:restartNumberingAfterBreak="0">
+    <w:nsid w:val="42933DE2"/>
+    <w:multiLevelType w:val="multilevel"/>
+    <w:tmpl w:val="9AC63F02"/>
+    <w:lvl w:ilvl="0">
+      <w:start w:val="1"/>
+      <w:numFmt w:val="bullet"/>
+      <w:lvlText w:val=""/>
+      <w:lvlJc w:val="left"/>
+      <w:pPr>
+        <w:tabs>
+          <w:tab w:val="num" w:pos="720"/>
+        </w:tabs>
+        <w:ind w:left="720" w:hanging="360"/>
+      </w:pPr>
+      <w:rPr>
+        <w:rFonts w:ascii="Symbol" w:hAnsi="Symbol" w:hint="default"/>
+        <w:sz w:val="20"/>
+      </w:rPr>
+    </w:lvl>
+    <w:lvl w:ilvl="1" w:tentative="1">
+      <w:start w:val="1"/>
+      <w:numFmt w:val="bullet"/>
+      <w:lvlText w:val=""/>
+      <w:lvlJc w:val="left"/>
+      <w:pPr>
+        <w:tabs>
+          <w:tab w:val="num" w:pos="1440"/>
+        </w:tabs>
+        <w:ind w:left="1440" w:hanging="360"/>
+      </w:pPr>
+      <w:rPr>
+        <w:rFonts w:ascii="Symbol" w:hAnsi="Symbol" w:hint="default"/>
+        <w:sz w:val="20"/>
+      </w:rPr>
+    </w:lvl>
+    <w:lvl w:ilvl="2" w:tentative="1">
+      <w:start w:val="1"/>
+      <w:numFmt w:val="bullet"/>
+      <w:lvlText w:val=""/>
+      <w:lvlJc w:val="left"/>
+      <w:pPr>
+        <w:tabs>
+          <w:tab w:val="num" w:pos="2160"/>
+        </w:tabs>
+        <w:ind w:left="2160" w:hanging="360"/>
+      </w:pPr>
+      <w:rPr>
+        <w:rFonts w:ascii="Symbol" w:hAnsi="Symbol" w:hint="default"/>
+        <w:sz w:val="20"/>
+      </w:rPr>
+    </w:lvl>
+    <w:lvl w:ilvl="3" w:tentative="1">
+      <w:start w:val="1"/>
+      <w:numFmt w:val="bullet"/>
+      <w:lvlText w:val=""/>
+      <w:lvlJc w:val="left"/>
+      <w:pPr>
+        <w:tabs>
+          <w:tab w:val="num" w:pos="2880"/>
+        </w:tabs>
+        <w:ind w:left="2880" w:hanging="360"/>
+      </w:pPr>
+      <w:rPr>
+        <w:rFonts w:ascii="Symbol" w:hAnsi="Symbol" w:hint="default"/>
+        <w:sz w:val="20"/>
+      </w:rPr>
+    </w:lvl>
+    <w:lvl w:ilvl="4" w:tentative="1">
+      <w:start w:val="1"/>
+      <w:numFmt w:val="bullet"/>
+      <w:lvlText w:val=""/>
+      <w:lvlJc w:val="left"/>
+      <w:pPr>
+        <w:tabs>
+          <w:tab w:val="num" w:pos="3600"/>
+        </w:tabs>
+        <w:ind w:left="3600" w:hanging="360"/>
+      </w:pPr>
+      <w:rPr>
+        <w:rFonts w:ascii="Symbol" w:hAnsi="Symbol" w:hint="default"/>
+        <w:sz w:val="20"/>
+      </w:rPr>
+    </w:lvl>
+    <w:lvl w:ilvl="5" w:tentative="1">
+      <w:start w:val="1"/>
+      <w:numFmt w:val="bullet"/>
+      <w:lvlText w:val=""/>
+      <w:lvlJc w:val="left"/>
+      <w:pPr>
+        <w:tabs>
+          <w:tab w:val="num" w:pos="4320"/>
+        </w:tabs>
+        <w:ind w:left="4320" w:hanging="360"/>
+      </w:pPr>
+      <w:rPr>
+        <w:rFonts w:ascii="Symbol" w:hAnsi="Symbol" w:hint="default"/>
+        <w:sz w:val="20"/>
+      </w:rPr>
+    </w:lvl>
+    <w:lvl w:ilvl="6" w:tentative="1">
+      <w:start w:val="1"/>
+      <w:numFmt w:val="bullet"/>
+      <w:lvlText w:val=""/>
+      <w:lvlJc w:val="left"/>
+      <w:pPr>
+        <w:tabs>
+          <w:tab w:val="num" w:pos="5040"/>
+        </w:tabs>
+        <w:ind w:left="5040" w:hanging="360"/>
+      </w:pPr>
+      <w:rPr>
+        <w:rFonts w:ascii="Symbol" w:hAnsi="Symbol" w:hint="default"/>
+        <w:sz w:val="20"/>
+      </w:rPr>
+    </w:lvl>
+    <w:lvl w:ilvl="7" w:tentative="1">
+      <w:start w:val="1"/>
+      <w:numFmt w:val="bullet"/>
+      <w:lvlText w:val=""/>
+      <w:lvlJc w:val="left"/>
+      <w:pPr>
+        <w:tabs>
+          <w:tab w:val="num" w:pos="5760"/>
+        </w:tabs>
+        <w:ind w:left="5760" w:hanging="360"/>
+      </w:pPr>
+      <w:rPr>
+        <w:rFonts w:ascii="Symbol" w:hAnsi="Symbol" w:hint="default"/>
+        <w:sz w:val="20"/>
+      </w:rPr>
+    </w:lvl>
+    <w:lvl w:ilvl="8" w:tentative="1">
+      <w:start w:val="1"/>
+      <w:numFmt w:val="bullet"/>
+      <w:lvlText w:val=""/>
+      <w:lvlJc w:val="left"/>
+      <w:pPr>
+        <w:tabs>
+          <w:tab w:val="num" w:pos="6480"/>
+        </w:tabs>
+        <w:ind w:left="6480" w:hanging="360"/>
+      </w:pPr>
+      <w:rPr>
+        <w:rFonts w:ascii="Symbol" w:hAnsi="Symbol" w:hint="default"/>
+        <w:sz w:val="20"/>
+      </w:rPr>
+    </w:lvl>
+  </w:abstractNum>
+  <w:abstractNum w:abstractNumId="4" w15:restartNumberingAfterBreak="0">
     <w:nsid w:val="4D77234F"/>
     <w:multiLevelType w:val="multilevel"/>
     <w:tmpl w:val="96DAA3BE"/>
@@ -7986,7 +8397,7 @@
       </w:rPr>
     </w:lvl>
   </w:abstractNum>
-  <w:abstractNum w:abstractNumId="3" w15:restartNumberingAfterBreak="0">
+  <w:abstractNum w:abstractNumId="5" w15:restartNumberingAfterBreak="0">
     <w:nsid w:val="554D2C07"/>
     <w:multiLevelType w:val="multilevel"/>
     <w:tmpl w:val="AA088598"/>
@@ -8099,7 +8510,7 @@
       </w:pPr>
     </w:lvl>
   </w:abstractNum>
-  <w:abstractNum w:abstractNumId="4" w15:restartNumberingAfterBreak="0">
+  <w:abstractNum w:abstractNumId="6" w15:restartNumberingAfterBreak="0">
     <w:nsid w:val="639A5595"/>
     <w:multiLevelType w:val="multilevel"/>
     <w:tmpl w:val="F6B4E188"/>
@@ -8248,7 +8659,156 @@
       </w:rPr>
     </w:lvl>
   </w:abstractNum>
-  <w:abstractNum w:abstractNumId="5" w15:restartNumberingAfterBreak="0">
+  <w:abstractNum w:abstractNumId="7" w15:restartNumberingAfterBreak="0">
+    <w:nsid w:val="6A494D8A"/>
+    <w:multiLevelType w:val="multilevel"/>
+    <w:tmpl w:val="B6D46BD8"/>
+    <w:lvl w:ilvl="0">
+      <w:start w:val="1"/>
+      <w:numFmt w:val="bullet"/>
+      <w:lvlText w:val=""/>
+      <w:lvlJc w:val="left"/>
+      <w:pPr>
+        <w:tabs>
+          <w:tab w:val="num" w:pos="720"/>
+        </w:tabs>
+        <w:ind w:left="720" w:hanging="360"/>
+      </w:pPr>
+      <w:rPr>
+        <w:rFonts w:ascii="Symbol" w:hAnsi="Symbol" w:hint="default"/>
+        <w:sz w:val="20"/>
+      </w:rPr>
+    </w:lvl>
+    <w:lvl w:ilvl="1" w:tentative="1">
+      <w:start w:val="1"/>
+      <w:numFmt w:val="bullet"/>
+      <w:lvlText w:val=""/>
+      <w:lvlJc w:val="left"/>
+      <w:pPr>
+        <w:tabs>
+          <w:tab w:val="num" w:pos="1440"/>
+        </w:tabs>
+        <w:ind w:left="1440" w:hanging="360"/>
+      </w:pPr>
+      <w:rPr>
+        <w:rFonts w:ascii="Symbol" w:hAnsi="Symbol" w:hint="default"/>
+        <w:sz w:val="20"/>
+      </w:rPr>
+    </w:lvl>
+    <w:lvl w:ilvl="2" w:tentative="1">
+      <w:start w:val="1"/>
+      <w:numFmt w:val="bullet"/>
+      <w:lvlText w:val=""/>
+      <w:lvlJc w:val="left"/>
+      <w:pPr>
+        <w:tabs>
+          <w:tab w:val="num" w:pos="2160"/>
+        </w:tabs>
+        <w:ind w:left="2160" w:hanging="360"/>
+      </w:pPr>
+      <w:rPr>
+        <w:rFonts w:ascii="Symbol" w:hAnsi="Symbol" w:hint="default"/>
+        <w:sz w:val="20"/>
+      </w:rPr>
+    </w:lvl>
+    <w:lvl w:ilvl="3" w:tentative="1">
+      <w:start w:val="1"/>
+      <w:numFmt w:val="bullet"/>
+      <w:lvlText w:val=""/>
+      <w:lvlJc w:val="left"/>
+      <w:pPr>
+        <w:tabs>
+          <w:tab w:val="num" w:pos="2880"/>
+        </w:tabs>
+        <w:ind w:left="2880" w:hanging="360"/>
+      </w:pPr>
+      <w:rPr>
+        <w:rFonts w:ascii="Symbol" w:hAnsi="Symbol" w:hint="default"/>
+        <w:sz w:val="20"/>
+      </w:rPr>
+    </w:lvl>
+    <w:lvl w:ilvl="4" w:tentative="1">
+      <w:start w:val="1"/>
+      <w:numFmt w:val="bullet"/>
+      <w:lvlText w:val=""/>
+      <w:lvlJc w:val="left"/>
+      <w:pPr>
+        <w:tabs>
+          <w:tab w:val="num" w:pos="3600"/>
+        </w:tabs>
+        <w:ind w:left="3600" w:hanging="360"/>
+      </w:pPr>
+      <w:rPr>
+        <w:rFonts w:ascii="Symbol" w:hAnsi="Symbol" w:hint="default"/>
+        <w:sz w:val="20"/>
+      </w:rPr>
+    </w:lvl>
+    <w:lvl w:ilvl="5" w:tentative="1">
+      <w:start w:val="1"/>
+      <w:numFmt w:val="bullet"/>
+      <w:lvlText w:val=""/>
+      <w:lvlJc w:val="left"/>
+      <w:pPr>
+        <w:tabs>
+          <w:tab w:val="num" w:pos="4320"/>
+        </w:tabs>
+        <w:ind w:left="4320" w:hanging="360"/>
+      </w:pPr>
+      <w:rPr>
+        <w:rFonts w:ascii="Symbol" w:hAnsi="Symbol" w:hint="default"/>
+        <w:sz w:val="20"/>
+      </w:rPr>
+    </w:lvl>
+    <w:lvl w:ilvl="6" w:tentative="1">
+      <w:start w:val="1"/>
+      <w:numFmt w:val="bullet"/>
+      <w:lvlText w:val=""/>
+      <w:lvlJc w:val="left"/>
+      <w:pPr>
+        <w:tabs>
+          <w:tab w:val="num" w:pos="5040"/>
+        </w:tabs>
+        <w:ind w:left="5040" w:hanging="360"/>
+      </w:pPr>
+      <w:rPr>
+        <w:rFonts w:ascii="Symbol" w:hAnsi="Symbol" w:hint="default"/>
+        <w:sz w:val="20"/>
+      </w:rPr>
+    </w:lvl>
+    <w:lvl w:ilvl="7" w:tentative="1">
+      <w:start w:val="1"/>
+      <w:numFmt w:val="bullet"/>
+      <w:lvlText w:val=""/>
+      <w:lvlJc w:val="left"/>
+      <w:pPr>
+        <w:tabs>
+          <w:tab w:val="num" w:pos="5760"/>
+        </w:tabs>
+        <w:ind w:left="5760" w:hanging="360"/>
+      </w:pPr>
+      <w:rPr>
+        <w:rFonts w:ascii="Symbol" w:hAnsi="Symbol" w:hint="default"/>
+        <w:sz w:val="20"/>
+      </w:rPr>
+    </w:lvl>
+    <w:lvl w:ilvl="8" w:tentative="1">
+      <w:start w:val="1"/>
+      <w:numFmt w:val="bullet"/>
+      <w:lvlText w:val=""/>
+      <w:lvlJc w:val="left"/>
+      <w:pPr>
+        <w:tabs>
+          <w:tab w:val="num" w:pos="6480"/>
+        </w:tabs>
+        <w:ind w:left="6480" w:hanging="360"/>
+      </w:pPr>
+      <w:rPr>
+        <w:rFonts w:ascii="Symbol" w:hAnsi="Symbol" w:hint="default"/>
+        <w:sz w:val="20"/>
+      </w:rPr>
+    </w:lvl>
+  </w:abstractNum>
+  <w:abstractNum w:abstractNumId="8" w15:restartNumberingAfterBreak="0">
     <w:nsid w:val="7FD97F3F"/>
     <w:multiLevelType w:val="multilevel"/>
     <w:tmpl w:val="C26A0932"/>
@@ -8362,22 +8922,31 @@
     </w:lvl>
   </w:abstractNum>
   <w:num w:numId="1" w16cid:durableId="1447044137">
+    <w:abstractNumId w:val="6"/>
+  </w:num>
+  <w:num w:numId="2" w16cid:durableId="337197054">
+    <w:abstractNumId w:val="8"/>
+  </w:num>
+  <w:num w:numId="3" w16cid:durableId="772478045">
     <w:abstractNumId w:val="4"/>
   </w:num>
-  <w:num w:numId="2" w16cid:durableId="337197054">
+  <w:num w:numId="4" w16cid:durableId="2126776364">
+    <w:abstractNumId w:val="1"/>
+  </w:num>
+  <w:num w:numId="5" w16cid:durableId="391076773">
+    <w:abstractNumId w:val="2"/>
+  </w:num>
+  <w:num w:numId="6" w16cid:durableId="1240866618">
     <w:abstractNumId w:val="5"/>
   </w:num>
-  <w:num w:numId="3" w16cid:durableId="772478045">
-    <w:abstractNumId w:val="2"/>
+  <w:num w:numId="7" w16cid:durableId="1402601883">
+    <w:abstractNumId w:val="7"/>
   </w:num>
-  <w:num w:numId="4" w16cid:durableId="2126776364">
+  <w:num w:numId="8" w16cid:durableId="1587884862">
+    <w:abstractNumId w:val="3"/>
+  </w:num>
+  <w:num w:numId="9" w16cid:durableId="589780617">
     <w:abstractNumId w:val="0"/>
-  </w:num>
-  <w:num w:numId="5" w16cid:durableId="391076773">
-    <w:abstractNumId w:val="1"/>
-  </w:num>
-  <w:num w:numId="6" w16cid:durableId="1240866618">
-    <w:abstractNumId w:val="3"/>
   </w:num>
 </w:numbering>
 </file>

</xml_diff>